<commit_message>
Update Application Monitoring - Add new features and updates
</commit_message>
<xml_diff>
--- a/notes/Complete Detailed Milestone.docx
+++ b/notes/Complete Detailed Milestone.docx
@@ -34,7 +34,15 @@
     </w:p>
     <w:p>
       <w:r>
-        <w:t>Total Duration  → 10 Weeks</w:t>
+        <w:t xml:space="preserve">Total </w:t>
+      </w:r>
+      <w:proofErr w:type="gramStart"/>
+      <w:r>
+        <w:t>Duration  →</w:t>
+      </w:r>
+      <w:proofErr w:type="gramEnd"/>
+      <w:r>
+        <w:t xml:space="preserve"> 10 Weeks</w:t>
       </w:r>
     </w:p>
     <w:p>
@@ -65,11 +73,6 @@
     <w:p>
       <w:r>
         <w:t>Extra           → Firebase Crashlytics (on top)</w:t>
-      </w:r>
-    </w:p>
-    <w:p>
-      <w:r>
-        <w:t>AI Tools        → Cursor + Claude + ChatGPT</w:t>
       </w:r>
     </w:p>
     <w:p>
@@ -267,12 +270,12 @@
     </w:p>
     <w:p>
       <w:r>
+        <w:t>Every time the Flutter app makes an API call it will send this data to your backend:</w:t>
+      </w:r>
+    </w:p>
+    <w:p>
+      <w:r>
         <w:lastRenderedPageBreak/>
-        <w:t>Every time the Flutter app makes an API call it will send this data to your backend:</w:t>
-      </w:r>
-    </w:p>
-    <w:p>
-      <w:r>
         <w:t>Timestamp          → When did this happen</w:t>
       </w:r>
     </w:p>
@@ -506,33 +509,63 @@
       </w:r>
     </w:p>
     <w:p>
-      <w:r>
-        <w:t>api_name         → which API was called</w:t>
-      </w:r>
-    </w:p>
-    <w:p>
-      <w:r>
-        <w:t>response_time    → how long in milliseconds</w:t>
-      </w:r>
-    </w:p>
-    <w:p>
-      <w:r>
-        <w:t>status_code      → HTTP status code</w:t>
-      </w:r>
-    </w:p>
-    <w:p>
-      <w:r>
-        <w:t>device_info      → device details</w:t>
-      </w:r>
-    </w:p>
-    <w:p>
-      <w:r>
-        <w:t>app_version      → app version number</w:t>
-      </w:r>
-    </w:p>
-    <w:p>
-      <w:r>
-        <w:t>session_id       → user session identifier</w:t>
+      <w:proofErr w:type="spellStart"/>
+      <w:r>
+        <w:t>api_name</w:t>
+      </w:r>
+      <w:proofErr w:type="spellEnd"/>
+      <w:r>
+        <w:t xml:space="preserve">         → which API was called</w:t>
+      </w:r>
+    </w:p>
+    <w:p>
+      <w:proofErr w:type="spellStart"/>
+      <w:r>
+        <w:t>response_time</w:t>
+      </w:r>
+      <w:proofErr w:type="spellEnd"/>
+      <w:r>
+        <w:t xml:space="preserve">    → how long in milliseconds</w:t>
+      </w:r>
+    </w:p>
+    <w:p>
+      <w:proofErr w:type="spellStart"/>
+      <w:r>
+        <w:t>status_code</w:t>
+      </w:r>
+      <w:proofErr w:type="spellEnd"/>
+      <w:r>
+        <w:t xml:space="preserve">      → HTTP status code</w:t>
+      </w:r>
+    </w:p>
+    <w:p>
+      <w:proofErr w:type="spellStart"/>
+      <w:r>
+        <w:t>device_info</w:t>
+      </w:r>
+      <w:proofErr w:type="spellEnd"/>
+      <w:r>
+        <w:t xml:space="preserve">      → device details</w:t>
+      </w:r>
+    </w:p>
+    <w:p>
+      <w:proofErr w:type="spellStart"/>
+      <w:r>
+        <w:t>app_version</w:t>
+      </w:r>
+      <w:proofErr w:type="spellEnd"/>
+      <w:r>
+        <w:t xml:space="preserve">      → app version number</w:t>
+      </w:r>
+    </w:p>
+    <w:p>
+      <w:proofErr w:type="spellStart"/>
+      <w:r>
+        <w:t>session_id</w:t>
+      </w:r>
+      <w:proofErr w:type="spellEnd"/>
+      <w:r>
+        <w:t xml:space="preserve">       → user session identifier</w:t>
       </w:r>
     </w:p>
     <w:p>
@@ -558,28 +591,53 @@
       </w:r>
     </w:p>
     <w:p>
-      <w:r>
-        <w:t>error_message    → full error description</w:t>
-      </w:r>
-    </w:p>
-    <w:p>
-      <w:r>
-        <w:t>error_type       → client error or server error</w:t>
-      </w:r>
-    </w:p>
-    <w:p>
-      <w:r>
-        <w:t>api_name         → which API caused it</w:t>
-      </w:r>
-    </w:p>
-    <w:p>
-      <w:r>
-        <w:t>device_info      → device details</w:t>
-      </w:r>
-    </w:p>
-    <w:p>
-      <w:r>
-        <w:t>stack_trace      → technical error details</w:t>
+      <w:proofErr w:type="spellStart"/>
+      <w:r>
+        <w:t>error_message</w:t>
+      </w:r>
+      <w:proofErr w:type="spellEnd"/>
+      <w:r>
+        <w:t xml:space="preserve">    → full error description</w:t>
+      </w:r>
+    </w:p>
+    <w:p>
+      <w:proofErr w:type="spellStart"/>
+      <w:r>
+        <w:t>error_type</w:t>
+      </w:r>
+      <w:proofErr w:type="spellEnd"/>
+      <w:r>
+        <w:t xml:space="preserve">       → client error or server error</w:t>
+      </w:r>
+    </w:p>
+    <w:p>
+      <w:proofErr w:type="spellStart"/>
+      <w:r>
+        <w:t>api_name</w:t>
+      </w:r>
+      <w:proofErr w:type="spellEnd"/>
+      <w:r>
+        <w:t xml:space="preserve">         → which API caused it</w:t>
+      </w:r>
+    </w:p>
+    <w:p>
+      <w:proofErr w:type="spellStart"/>
+      <w:r>
+        <w:t>device_info</w:t>
+      </w:r>
+      <w:proofErr w:type="spellEnd"/>
+      <w:r>
+        <w:t xml:space="preserve">      → device details</w:t>
+      </w:r>
+    </w:p>
+    <w:p>
+      <w:proofErr w:type="spellStart"/>
+      <w:r>
+        <w:t>stack_trace</w:t>
+      </w:r>
+      <w:proofErr w:type="spellEnd"/>
+      <w:r>
+        <w:t xml:space="preserve">      → technical error details</w:t>
       </w:r>
     </w:p>
     <w:p>
@@ -605,23 +663,43 @@
       </w:r>
     </w:p>
     <w:p>
-      <w:r>
-        <w:t>avg_response     → average response time</w:t>
-      </w:r>
-    </w:p>
-    <w:p>
-      <w:r>
-        <w:t>total_requests   → total API calls in period</w:t>
-      </w:r>
-    </w:p>
-    <w:p>
-      <w:r>
-        <w:t>error_count      → number of errors in period</w:t>
-      </w:r>
-    </w:p>
-    <w:p>
-      <w:r>
-        <w:t>error_rate       → percentage of failed calls</w:t>
+      <w:proofErr w:type="spellStart"/>
+      <w:r>
+        <w:t>avg_response</w:t>
+      </w:r>
+      <w:proofErr w:type="spellEnd"/>
+      <w:r>
+        <w:t xml:space="preserve">     → average response time</w:t>
+      </w:r>
+    </w:p>
+    <w:p>
+      <w:proofErr w:type="spellStart"/>
+      <w:r>
+        <w:t>total_requests</w:t>
+      </w:r>
+      <w:proofErr w:type="spellEnd"/>
+      <w:r>
+        <w:t xml:space="preserve">   → total API calls in period</w:t>
+      </w:r>
+    </w:p>
+    <w:p>
+      <w:proofErr w:type="spellStart"/>
+      <w:r>
+        <w:t>error_count</w:t>
+      </w:r>
+      <w:proofErr w:type="spellEnd"/>
+      <w:r>
+        <w:t xml:space="preserve">      → number of errors in period</w:t>
+      </w:r>
+    </w:p>
+    <w:p>
+      <w:proofErr w:type="spellStart"/>
+      <w:r>
+        <w:t>error_rate</w:t>
+      </w:r>
+      <w:proofErr w:type="spellEnd"/>
+      <w:r>
+        <w:t xml:space="preserve">       → percentage of failed calls</w:t>
       </w:r>
     </w:p>
     <w:p>
@@ -647,8 +725,13 @@
       </w:r>
     </w:p>
     <w:p>
-      <w:r>
-        <w:t>alert_type       → what kind of alert</w:t>
+      <w:proofErr w:type="spellStart"/>
+      <w:r>
+        <w:t>alert_type</w:t>
+      </w:r>
+      <w:proofErr w:type="spellEnd"/>
+      <w:r>
+        <w:t xml:space="preserve">       → what kind of alert</w:t>
       </w:r>
     </w:p>
     <w:p>
@@ -849,7 +932,15 @@
         <w:t>Flutter SDK</w:t>
       </w:r>
       <w:r>
-        <w:t xml:space="preserve"> — download from flutter.dev. The framework for building the app.</w:t>
+        <w:t xml:space="preserve"> — download from </w:t>
+      </w:r>
+      <w:proofErr w:type="spellStart"/>
+      <w:r>
+        <w:t>flutter.dev</w:t>
+      </w:r>
+      <w:proofErr w:type="spellEnd"/>
+      <w:r>
+        <w:t>. The framework for building the app.</w:t>
       </w:r>
     </w:p>
     <w:p>
@@ -959,7 +1050,15 @@
     </w:p>
     <w:p>
       <w:r>
-        <w:t>Create a new Flutter project in VS Code. Name it something like "monitored_app" or your project name.</w:t>
+        <w:t>Create a new Flutter project in VS Code. Name it something like "</w:t>
+      </w:r>
+      <w:proofErr w:type="spellStart"/>
+      <w:r>
+        <w:t>monitored_app</w:t>
+      </w:r>
+      <w:proofErr w:type="spellEnd"/>
+      <w:r>
+        <w:t>" or your project name.</w:t>
       </w:r>
     </w:p>
     <w:p>
@@ -1302,7 +1401,15 @@
         <w:t>Express.js</w:t>
       </w:r>
       <w:r>
-        <w:t xml:space="preserve"> — a Node.js framework that makes building APIs much easier. Installed via npm (Node Package Manager which comes with Node.js).</w:t>
+        <w:t xml:space="preserve"> — a Node.js framework that makes building APIs much easier. Installed via </w:t>
+      </w:r>
+      <w:proofErr w:type="spellStart"/>
+      <w:r>
+        <w:t>npm</w:t>
+      </w:r>
+      <w:proofErr w:type="spellEnd"/>
+      <w:r>
+        <w:t xml:space="preserve"> (Node Package Manager which comes with Node.js).</w:t>
       </w:r>
     </w:p>
     <w:p>
@@ -1330,6 +1437,7 @@
       </w:r>
     </w:p>
     <w:p>
+      <w:proofErr w:type="spellStart"/>
       <w:r>
         <w:rPr>
           <w:b/>
@@ -1337,11 +1445,21 @@
         </w:rPr>
         <w:t>nodemon</w:t>
       </w:r>
-      <w:r>
-        <w:t xml:space="preserve"> — a development tool that automatically restarts your Node.js server when you make changes. Installed via npm.</w:t>
-      </w:r>
-    </w:p>
-    <w:p>
+      <w:proofErr w:type="spellEnd"/>
+      <w:r>
+        <w:t xml:space="preserve"> — a development tool that automatically restarts your Node.js server when you make changes. Installed via </w:t>
+      </w:r>
+      <w:proofErr w:type="spellStart"/>
+      <w:r>
+        <w:t>npm</w:t>
+      </w:r>
+      <w:proofErr w:type="spellEnd"/>
+      <w:r>
+        <w:t>.</w:t>
+      </w:r>
+    </w:p>
+    <w:p>
+      <w:proofErr w:type="spellStart"/>
       <w:r>
         <w:rPr>
           <w:b/>
@@ -1349,8 +1467,17 @@
         </w:rPr>
         <w:t>dotenv</w:t>
       </w:r>
-      <w:r>
-        <w:t xml:space="preserve"> — manages environment variables like database passwords securely. Installed via npm.</w:t>
+      <w:proofErr w:type="spellEnd"/>
+      <w:r>
+        <w:t xml:space="preserve"> — manages environment variables like database passwords securely. Installed via </w:t>
+      </w:r>
+      <w:proofErr w:type="spellStart"/>
+      <w:r>
+        <w:t>npm</w:t>
+      </w:r>
+      <w:proofErr w:type="spellEnd"/>
+      <w:r>
+        <w:t>.</w:t>
       </w:r>
     </w:p>
     <w:p>
@@ -1386,7 +1513,55 @@
     </w:p>
     <w:p>
       <w:r>
-        <w:t>Create a new folder called "backend". Open it in VS Code. Initialize a Node.js project using npm init command. Install required packages — Express, pg (PostgreSQL driver), dotenv, nodemon, and cors.</w:t>
+        <w:t xml:space="preserve">Create a new folder called "backend". Open it in VS Code. Initialize a Node.js project using </w:t>
+      </w:r>
+      <w:proofErr w:type="spellStart"/>
+      <w:r>
+        <w:t>npm</w:t>
+      </w:r>
+      <w:proofErr w:type="spellEnd"/>
+      <w:r>
+        <w:t xml:space="preserve"> </w:t>
+      </w:r>
+      <w:proofErr w:type="spellStart"/>
+      <w:r>
+        <w:t>init</w:t>
+      </w:r>
+      <w:proofErr w:type="spellEnd"/>
+      <w:r>
+        <w:t xml:space="preserve"> command. Install required packages — Express, </w:t>
+      </w:r>
+      <w:proofErr w:type="spellStart"/>
+      <w:r>
+        <w:t>pg</w:t>
+      </w:r>
+      <w:proofErr w:type="spellEnd"/>
+      <w:r>
+        <w:t xml:space="preserve"> (PostgreSQL driver), </w:t>
+      </w:r>
+      <w:proofErr w:type="spellStart"/>
+      <w:r>
+        <w:t>dotenv</w:t>
+      </w:r>
+      <w:proofErr w:type="spellEnd"/>
+      <w:r>
+        <w:t xml:space="preserve">, </w:t>
+      </w:r>
+      <w:proofErr w:type="spellStart"/>
+      <w:r>
+        <w:t>nodemon</w:t>
+      </w:r>
+      <w:proofErr w:type="spellEnd"/>
+      <w:r>
+        <w:t xml:space="preserve">, and </w:t>
+      </w:r>
+      <w:proofErr w:type="spellStart"/>
+      <w:r>
+        <w:t>cors</w:t>
+      </w:r>
+      <w:proofErr w:type="spellEnd"/>
+      <w:r>
+        <w:t>.</w:t>
       </w:r>
     </w:p>
     <w:p>
@@ -1590,7 +1765,15 @@
         <w:t>──</w:t>
       </w:r>
       <w:r>
-        <w:t xml:space="preserve"> db/                </w:t>
+        <w:t xml:space="preserve"> </w:t>
+      </w:r>
+      <w:proofErr w:type="spellStart"/>
+      <w:r>
+        <w:t>db</w:t>
+      </w:r>
+      <w:proofErr w:type="spellEnd"/>
+      <w:r>
+        <w:t xml:space="preserve">/                </w:t>
       </w:r>
       <w:r>
         <w:rPr>
@@ -1609,7 +1792,15 @@
     </w:p>
     <w:p>
       <w:r>
-        <w:t>└── .env               → environment variables (passwords etc)</w:t>
+        <w:t>└─</w:t>
+      </w:r>
+      <w:proofErr w:type="gramStart"/>
+      <w:r>
+        <w:t>─ .env</w:t>
+      </w:r>
+      <w:proofErr w:type="gramEnd"/>
+      <w:r>
+        <w:t xml:space="preserve">               → environment variables (passwords etc)</w:t>
       </w:r>
     </w:p>
     <w:p>
@@ -1632,7 +1823,23 @@
           <w:b/>
           <w:bCs/>
         </w:rPr>
-        <w:t>POST /api/logs</w:t>
+        <w:t>POST /</w:t>
+      </w:r>
+      <w:proofErr w:type="spellStart"/>
+      <w:r>
+        <w:rPr>
+          <w:b/>
+          <w:bCs/>
+        </w:rPr>
+        <w:t>api</w:t>
+      </w:r>
+      <w:proofErr w:type="spellEnd"/>
+      <w:r>
+        <w:rPr>
+          <w:b/>
+          <w:bCs/>
+        </w:rPr>
+        <w:t>/logs</w:t>
       </w:r>
       <w:r>
         <w:t xml:space="preserve"> — receives log data from Flutter app. Validates the incoming JSON data. Stores it in PostgreSQL logs table. Checks if alert conditions are triggered. Returns success response.</w:t>
@@ -1644,7 +1851,23 @@
           <w:b/>
           <w:bCs/>
         </w:rPr>
-        <w:t>GET /api/logs</w:t>
+        <w:t>GET /</w:t>
+      </w:r>
+      <w:proofErr w:type="spellStart"/>
+      <w:r>
+        <w:rPr>
+          <w:b/>
+          <w:bCs/>
+        </w:rPr>
+        <w:t>api</w:t>
+      </w:r>
+      <w:proofErr w:type="spellEnd"/>
+      <w:r>
+        <w:rPr>
+          <w:b/>
+          <w:bCs/>
+        </w:rPr>
+        <w:t>/logs</w:t>
       </w:r>
       <w:r>
         <w:t xml:space="preserve"> — returns log data to React dashboard. Supports filters for date range, API name, and device type. Returns paginated results.</w:t>
@@ -1656,7 +1879,23 @@
           <w:b/>
           <w:bCs/>
         </w:rPr>
-        <w:t>GET /api/metrics</w:t>
+        <w:t>GET /</w:t>
+      </w:r>
+      <w:proofErr w:type="spellStart"/>
+      <w:r>
+        <w:rPr>
+          <w:b/>
+          <w:bCs/>
+        </w:rPr>
+        <w:t>api</w:t>
+      </w:r>
+      <w:proofErr w:type="spellEnd"/>
+      <w:r>
+        <w:rPr>
+          <w:b/>
+          <w:bCs/>
+        </w:rPr>
+        <w:t>/metrics</w:t>
       </w:r>
       <w:r>
         <w:t xml:space="preserve"> — returns calculated metrics to React dashboard. Calculates average response time, total requests, error count, and error rate. Groups data by hour or day.</w:t>
@@ -1668,7 +1907,23 @@
           <w:b/>
           <w:bCs/>
         </w:rPr>
-        <w:t>GET /api/errors</w:t>
+        <w:t>GET /</w:t>
+      </w:r>
+      <w:proofErr w:type="spellStart"/>
+      <w:r>
+        <w:rPr>
+          <w:b/>
+          <w:bCs/>
+        </w:rPr>
+        <w:t>api</w:t>
+      </w:r>
+      <w:proofErr w:type="spellEnd"/>
+      <w:r>
+        <w:rPr>
+          <w:b/>
+          <w:bCs/>
+        </w:rPr>
+        <w:t>/errors</w:t>
       </w:r>
       <w:r>
         <w:t xml:space="preserve"> — returns error records to React dashboard. Groups similar errors together. Returns error count per hour.</w:t>
@@ -1680,7 +1935,23 @@
           <w:b/>
           <w:bCs/>
         </w:rPr>
-        <w:t>GET /api/alerts</w:t>
+        <w:t>GET /</w:t>
+      </w:r>
+      <w:proofErr w:type="spellStart"/>
+      <w:r>
+        <w:rPr>
+          <w:b/>
+          <w:bCs/>
+        </w:rPr>
+        <w:t>api</w:t>
+      </w:r>
+      <w:proofErr w:type="spellEnd"/>
+      <w:r>
+        <w:rPr>
+          <w:b/>
+          <w:bCs/>
+        </w:rPr>
+        <w:t>/alerts</w:t>
       </w:r>
       <w:r>
         <w:t xml:space="preserve"> — returns triggered alerts to React dashboard. Returns both active and resolved alerts.</w:t>
@@ -1692,7 +1963,23 @@
           <w:b/>
           <w:bCs/>
         </w:rPr>
-        <w:t>PUT /api/alerts/:id/resolve</w:t>
+        <w:t>PUT /</w:t>
+      </w:r>
+      <w:proofErr w:type="spellStart"/>
+      <w:r>
+        <w:rPr>
+          <w:b/>
+          <w:bCs/>
+        </w:rPr>
+        <w:t>api</w:t>
+      </w:r>
+      <w:proofErr w:type="spellEnd"/>
+      <w:r>
+        <w:rPr>
+          <w:b/>
+          <w:bCs/>
+        </w:rPr>
+        <w:t>/alerts/:id/resolve</w:t>
       </w:r>
       <w:r>
         <w:t xml:space="preserve"> — marks an alert as resolved when developer fixes the issue.</w:t>
@@ -1709,7 +1996,15 @@
     </w:p>
     <w:p>
       <w:r>
-        <w:t>Inside your POST /api/logs endpoint add logic that checks:</w:t>
+        <w:t>Inside your POST /</w:t>
+      </w:r>
+      <w:proofErr w:type="spellStart"/>
+      <w:r>
+        <w:t>api</w:t>
+      </w:r>
+      <w:proofErr w:type="spellEnd"/>
+      <w:r>
+        <w:t>/logs endpoint add logic that checks:</w:t>
       </w:r>
     </w:p>
     <w:p>
@@ -1884,6 +2179,7 @@
       </w:r>
     </w:p>
     <w:p>
+      <w:proofErr w:type="spellStart"/>
       <w:r>
         <w:rPr>
           <w:b/>
@@ -1891,11 +2187,13 @@
         </w:rPr>
         <w:t>pgAdmin</w:t>
       </w:r>
+      <w:proofErr w:type="spellEnd"/>
       <w:r>
         <w:t xml:space="preserve"> — comes with PostgreSQL installation. A visual tool to manage your database, view tables, and run queries. Much easier than command line for beginners.</w:t>
       </w:r>
     </w:p>
     <w:p>
+      <w:proofErr w:type="spellStart"/>
       <w:r>
         <w:rPr>
           <w:b/>
@@ -1903,8 +2201,17 @@
         </w:rPr>
         <w:t>DBeaver</w:t>
       </w:r>
-      <w:r>
-        <w:t xml:space="preserve"> — alternative to pgAdmin, some people find it easier. Download from dbeaver.io. Optional.</w:t>
+      <w:proofErr w:type="spellEnd"/>
+      <w:r>
+        <w:t xml:space="preserve"> — alternative to </w:t>
+      </w:r>
+      <w:proofErr w:type="spellStart"/>
+      <w:r>
+        <w:t>pgAdmin</w:t>
+      </w:r>
+      <w:proofErr w:type="spellEnd"/>
+      <w:r>
+        <w:t>, some people find it easier. Download from dbeaver.io. Optional.</w:t>
       </w:r>
     </w:p>
     <w:p>
@@ -1952,7 +2259,15 @@
     </w:p>
     <w:p>
       <w:r>
-        <w:t>Download and install PostgreSQL. During installation set a password for the default admin user — remember this password. After installation open pgAdmin to verify it is working.</w:t>
+        <w:t xml:space="preserve">Download and install PostgreSQL. During installation set a password for the default admin user — remember this password. After installation open </w:t>
+      </w:r>
+      <w:proofErr w:type="spellStart"/>
+      <w:r>
+        <w:t>pgAdmin</w:t>
+      </w:r>
+      <w:proofErr w:type="spellEnd"/>
+      <w:r>
+        <w:t xml:space="preserve"> to verify it is working.</w:t>
       </w:r>
     </w:p>
     <w:p>
@@ -1966,7 +2281,23 @@
     </w:p>
     <w:p>
       <w:r>
-        <w:t>In pgAdmin create a new database called "monitoring_db". This is where all your tables will live.</w:t>
+        <w:t xml:space="preserve">In </w:t>
+      </w:r>
+      <w:proofErr w:type="spellStart"/>
+      <w:r>
+        <w:t>pgAdmin</w:t>
+      </w:r>
+      <w:proofErr w:type="spellEnd"/>
+      <w:r>
+        <w:t xml:space="preserve"> create a new database called "</w:t>
+      </w:r>
+      <w:proofErr w:type="spellStart"/>
+      <w:r>
+        <w:t>monitoring_db</w:t>
+      </w:r>
+      <w:proofErr w:type="spellEnd"/>
+      <w:r>
+        <w:t>". This is where all your tables will live.</w:t>
       </w:r>
     </w:p>
     <w:p>
@@ -1980,7 +2311,15 @@
     </w:p>
     <w:p>
       <w:r>
-        <w:t>Create all four tables based on your schema designed in Milestone 1 — logs, errors, metrics, and alerts. Use pgAdmin's query tool to run the SQL commands. Cursor can generate these SQL commands for you if you describe the table structure.</w:t>
+        <w:t xml:space="preserve">Create all four tables based on your schema designed in Milestone 1 — logs, errors, metrics, and alerts. Use </w:t>
+      </w:r>
+      <w:proofErr w:type="spellStart"/>
+      <w:r>
+        <w:t>pgAdmin's</w:t>
+      </w:r>
+      <w:proofErr w:type="spellEnd"/>
+      <w:r>
+        <w:t xml:space="preserve"> query tool to run the SQL commands. Cursor can generate these SQL commands for you if you describe the table structure.</w:t>
       </w:r>
     </w:p>
     <w:p>
@@ -1994,7 +2333,23 @@
     </w:p>
     <w:p>
       <w:r>
-        <w:t>Add indexes on columns you will frequently query — timestamp, api_name, and status_code columns. Indexes make queries much faster especially when you have thousands of records.</w:t>
+        <w:t xml:space="preserve">Add indexes on columns you will frequently query — timestamp, </w:t>
+      </w:r>
+      <w:proofErr w:type="spellStart"/>
+      <w:r>
+        <w:t>api_name</w:t>
+      </w:r>
+      <w:proofErr w:type="spellEnd"/>
+      <w:r>
+        <w:t xml:space="preserve">, and </w:t>
+      </w:r>
+      <w:proofErr w:type="spellStart"/>
+      <w:r>
+        <w:t>status_code</w:t>
+      </w:r>
+      <w:proofErr w:type="spellEnd"/>
+      <w:r>
+        <w:t xml:space="preserve"> columns. Indexes make queries much faster especially when you have thousands of records.</w:t>
       </w:r>
     </w:p>
     <w:p>
@@ -2008,12 +2363,28 @@
     </w:p>
     <w:p>
       <w:r>
-        <w:t>In your Node.js backend configure the database connection using your PostgreSQL credentials — host, database name, username, password, and port. Use environment variables (.env file) to store these credentials securely — never put passwords directly in code.</w:t>
-      </w:r>
-    </w:p>
-    <w:p>
-      <w:r>
-        <w:t>Test the connection by running your backend and making a test API call. Verify data appears in pgAdmin.</w:t>
+        <w:t xml:space="preserve">In your Node.js backend </w:t>
+      </w:r>
+      <w:proofErr w:type="gramStart"/>
+      <w:r>
+        <w:t>configure</w:t>
+      </w:r>
+      <w:proofErr w:type="gramEnd"/>
+      <w:r>
+        <w:t xml:space="preserve"> the database connection using your PostgreSQL credentials — host, database name, username, password, and port. Use environment variables (.env file) to store these credentials securely — never put passwords directly in code.</w:t>
+      </w:r>
+    </w:p>
+    <w:p>
+      <w:r>
+        <w:t xml:space="preserve">Test the connection by running your backend and making a test API call. Verify data appears in </w:t>
+      </w:r>
+      <w:proofErr w:type="spellStart"/>
+      <w:r>
+        <w:t>pgAdmin</w:t>
+      </w:r>
+      <w:proofErr w:type="spellEnd"/>
+      <w:r>
+        <w:t>.</w:t>
       </w:r>
     </w:p>
     <w:p>
@@ -2116,8 +2487,13 @@
         </w:numPr>
       </w:pPr>
       <w:r>
-        <w:t>Key queries tested and working in pgAdmin</w:t>
-      </w:r>
+        <w:t xml:space="preserve">Key queries tested and working in </w:t>
+      </w:r>
+      <w:proofErr w:type="spellStart"/>
+      <w:r>
+        <w:t>pgAdmin</w:t>
+      </w:r>
+      <w:proofErr w:type="spellEnd"/>
     </w:p>
     <w:p>
       <w:r>
@@ -2197,7 +2573,15 @@
         <w:t>Chart.js with react-chartjs-2</w:t>
       </w:r>
       <w:r>
-        <w:t xml:space="preserve"> — charting library for drawing line charts, bar charts, and pie charts. Installed via npm.</w:t>
+        <w:t xml:space="preserve"> — charting library for drawing line charts, bar charts, and pie charts. Installed via </w:t>
+      </w:r>
+      <w:proofErr w:type="spellStart"/>
+      <w:r>
+        <w:t>npm</w:t>
+      </w:r>
+      <w:proofErr w:type="spellEnd"/>
+      <w:r>
+        <w:t>.</w:t>
       </w:r>
     </w:p>
     <w:p>
@@ -2209,7 +2593,15 @@
         <w:t>Axios</w:t>
       </w:r>
       <w:r>
-        <w:t xml:space="preserve"> — library for making HTTP requests from React to your Node.js backend. Installed via npm.</w:t>
+        <w:t xml:space="preserve"> — library for making HTTP requests from React to your Node.js backend. Installed via </w:t>
+      </w:r>
+      <w:proofErr w:type="spellStart"/>
+      <w:r>
+        <w:t>npm</w:t>
+      </w:r>
+      <w:proofErr w:type="spellEnd"/>
+      <w:r>
+        <w:t>.</w:t>
       </w:r>
     </w:p>
     <w:p>
@@ -2221,7 +2613,15 @@
         <w:t>Tailwind CSS</w:t>
       </w:r>
       <w:r>
-        <w:t xml:space="preserve"> — utility-based CSS framework for styling your dashboard quickly and professionally. Installed via npm.</w:t>
+        <w:t xml:space="preserve"> — utility-based CSS framework for styling your dashboard quickly and professionally. Installed via </w:t>
+      </w:r>
+      <w:proofErr w:type="spellStart"/>
+      <w:r>
+        <w:t>npm</w:t>
+      </w:r>
+      <w:proofErr w:type="spellEnd"/>
+      <w:r>
+        <w:t>.</w:t>
       </w:r>
     </w:p>
     <w:p>
@@ -2281,7 +2681,15 @@
     </w:p>
     <w:p>
       <w:r>
-        <w:t>Create a new React project in a folder called "dashboard". Install required packages — axios, chart.js, react-chartjs-2, and tailwind CSS.</w:t>
+        <w:t xml:space="preserve">Create a new React project in a folder called "dashboard". Install required packages — </w:t>
+      </w:r>
+      <w:proofErr w:type="spellStart"/>
+      <w:r>
+        <w:t>axios</w:t>
+      </w:r>
+      <w:proofErr w:type="spellEnd"/>
+      <w:r>
+        <w:t>, chart.js, react-chartjs-2, and tailwind CSS.</w:t>
       </w:r>
     </w:p>
     <w:p>
@@ -2363,7 +2771,15 @@
         <w:t>Response Time Chart</w:t>
       </w:r>
       <w:r>
-        <w:t xml:space="preserve"> — a line chart showing how response time changes over time. X axis is time, Y axis is milliseconds. This is your most important chart for performance monitoring and RCA.</w:t>
+        <w:t xml:space="preserve"> — a line chart showing how response time changes over time. X axis is </w:t>
+      </w:r>
+      <w:proofErr w:type="gramStart"/>
+      <w:r>
+        <w:t>time,</w:t>
+      </w:r>
+      <w:proofErr w:type="gramEnd"/>
+      <w:r>
+        <w:t xml:space="preserve"> Y axis is milliseconds. This is your most important chart for performance monitoring and RCA.</w:t>
       </w:r>
     </w:p>
     <w:p>
@@ -2387,7 +2803,15 @@
         <w:t>Active Alerts Panel</w:t>
       </w:r>
       <w:r>
-        <w:t xml:space="preserve"> — a list of current alerts with severity color coding. Red for critical, orange for high, yellow for medium, green for low.</w:t>
+        <w:t xml:space="preserve"> — a list of current alerts with severity </w:t>
+      </w:r>
+      <w:proofErr w:type="spellStart"/>
+      <w:r>
+        <w:t>color</w:t>
+      </w:r>
+      <w:proofErr w:type="spellEnd"/>
+      <w:r>
+        <w:t xml:space="preserve"> coding. Red for critical, orange for high, yellow for medium, green for low.</w:t>
       </w:r>
     </w:p>
     <w:p>
@@ -2399,7 +2823,15 @@
         <w:t>Recent Logs Table</w:t>
       </w:r>
       <w:r>
-        <w:t xml:space="preserve"> — a table showing the last 50 API calls with timestamp, API name, response time, and status code. Color code rows — green for fast successful calls, red for errors, yellow for slow calls.</w:t>
+        <w:t xml:space="preserve"> — a table showing the last 50 API calls with timestamp, API name, response time, and status code. </w:t>
+      </w:r>
+      <w:proofErr w:type="spellStart"/>
+      <w:r>
+        <w:t>Color</w:t>
+      </w:r>
+      <w:proofErr w:type="spellEnd"/>
+      <w:r>
+        <w:t xml:space="preserve"> code rows — green for fast successful calls, red for errors, yellow for slow calls.</w:t>
       </w:r>
     </w:p>
     <w:p>
@@ -2449,7 +2881,23 @@
     </w:p>
     <w:p>
       <w:r>
-        <w:t>The error details and when it started. The response time trend just before and during the error. All log entries from the same time period. Similar errors grouped together. A simple classification — Client Side Error, Server Side Error, or Network Error based on the status code and error type.</w:t>
+        <w:t xml:space="preserve">The error details and when it started. The response time trend just before and during the error. All log entries from the same time period. Similar errors grouped together. A simple classification — </w:t>
+      </w:r>
+      <w:proofErr w:type="gramStart"/>
+      <w:r>
+        <w:t>Client Side</w:t>
+      </w:r>
+      <w:proofErr w:type="gramEnd"/>
+      <w:r>
+        <w:t xml:space="preserve"> Error, </w:t>
+      </w:r>
+      <w:proofErr w:type="gramStart"/>
+      <w:r>
+        <w:t>Server Side</w:t>
+      </w:r>
+      <w:proofErr w:type="gramEnd"/>
+      <w:r>
+        <w:t xml:space="preserve"> Error, or Network Error based on the status code and error type.</w:t>
       </w:r>
     </w:p>
     <w:p>
@@ -2646,6 +3094,7 @@
       </w:r>
     </w:p>
     <w:p>
+      <w:proofErr w:type="spellStart"/>
       <w:r>
         <w:rPr>
           <w:b/>
@@ -2653,6 +3102,7 @@
         </w:rPr>
         <w:t>pgAdmin</w:t>
       </w:r>
+      <w:proofErr w:type="spellEnd"/>
       <w:r>
         <w:t xml:space="preserve"> — to verify data is being stored correctly.</w:t>
       </w:r>
@@ -2690,7 +3140,15 @@
     </w:p>
     <w:p>
       <w:r>
-        <w:t>Run your Node.js backend locally. Run Flutter app on emulator. Press buttons in the app. Open pgAdmin and verify log records are appearing in the database in real time. This confirms the first connection is working.</w:t>
+        <w:t xml:space="preserve">Run your Node.js backend locally. Run Flutter app on emulator. Press buttons in the app. Open </w:t>
+      </w:r>
+      <w:proofErr w:type="spellStart"/>
+      <w:r>
+        <w:t>pgAdmin</w:t>
+      </w:r>
+      <w:proofErr w:type="spellEnd"/>
+      <w:r>
+        <w:t xml:space="preserve"> and verify log records are appearing in the database in real time. This confirms the first connection is working.</w:t>
       </w:r>
     </w:p>
     <w:p>
@@ -2992,7 +3450,15 @@
     </w:p>
     <w:p>
       <w:r>
-        <w:t>Sign up at aws.amazon.com. Add a credit card (required even for free tier — but you will not be charged if you stay within limits). Understand free tier limits — EC2 t2.micro 750 hours per month, RDS 750 hours per month. Set up a billing alert at $5 so you are notified before any charges occur.</w:t>
+        <w:t>Sign up at aws.amazon.com. Add a credit card (required even for free tier — but you will not be charged if you stay within limits). Understand free tier limits — EC2 t</w:t>
+      </w:r>
+      <w:proofErr w:type="gramStart"/>
+      <w:r>
+        <w:t>2.micro</w:t>
+      </w:r>
+      <w:proofErr w:type="gramEnd"/>
+      <w:r>
+        <w:t xml:space="preserve"> 750 hours per month, RDS 750 hours per month. Set up a billing alert at $5 so you are notified before any charges occur.</w:t>
       </w:r>
     </w:p>
     <w:p>
@@ -3006,7 +3472,15 @@
     </w:p>
     <w:p>
       <w:r>
-        <w:t>In AWS Console go to EC2 and launch a new instance. Select Ubuntu Server as the operating system. Select t2.micro instance type (free tier). Download the key pair file — this is your password to access the server. Keep it safe. Configure security groups to allow HTTP (port 80), HTTPS (port 443), and your Node.js port (3000 or 5000).</w:t>
+        <w:t>In AWS Console go to EC2 and launch a new instance. Select Ubuntu Server as the operating system. Select t</w:t>
+      </w:r>
+      <w:proofErr w:type="gramStart"/>
+      <w:r>
+        <w:t>2.micro</w:t>
+      </w:r>
+      <w:proofErr w:type="gramEnd"/>
+      <w:r>
+        <w:t xml:space="preserve"> instance type (free tier). Download the key pair file — this is your password to access the server. Keep it safe. Configure security groups to allow HTTP (port 80), HTTPS (port 443), and your Node.js port (3000 or 5000).</w:t>
       </w:r>
     </w:p>
     <w:p>
@@ -3020,7 +3494,15 @@
     </w:p>
     <w:p>
       <w:r>
-        <w:t>Connect to your EC2 instance using SSH. Install Node.js on the server. Install PM2 — a tool that keeps your Node.js backend running even when you disconnect. Copy your backend code to the server. Install dependencies using npm install. Start the backend using PM2. Verify it is running by accessing your EC2 public IP address in a browser.</w:t>
+        <w:t xml:space="preserve">Connect to your EC2 instance using SSH. Install Node.js on the server. Install PM2 — a tool that keeps your Node.js backend running even when you disconnect. Copy your backend code to the server. Install dependencies using </w:t>
+      </w:r>
+      <w:proofErr w:type="spellStart"/>
+      <w:r>
+        <w:t>npm</w:t>
+      </w:r>
+      <w:proofErr w:type="spellEnd"/>
+      <w:r>
+        <w:t xml:space="preserve"> install. Start the backend using PM2. Verify it is running by accessing your EC2 public IP address in a browser.</w:t>
       </w:r>
     </w:p>
     <w:p>
@@ -3034,7 +3516,15 @@
     </w:p>
     <w:p>
       <w:r>
-        <w:t>In AWS Console go to RDS and create a new database. Select PostgreSQL. Select db.t2.micro (free tier). Set a master username and password — remember these. Configure security group to allow connection from your EC2 instance only. After creation note the endpoint URL — this replaces localhost in your backend database connection.</w:t>
+        <w:t>In AWS Console go to RDS and create a new database. Select PostgreSQL. Select db.t</w:t>
+      </w:r>
+      <w:proofErr w:type="gramStart"/>
+      <w:r>
+        <w:t>2.micro</w:t>
+      </w:r>
+      <w:proofErr w:type="gramEnd"/>
+      <w:r>
+        <w:t xml:space="preserve"> (free tier). Set a master username and password — remember these. Configure security group to allow connection from your EC2 instance only. After creation note the endpoint URL — this replaces localhost in your backend database connection.</w:t>
       </w:r>
     </w:p>
     <w:p>
@@ -3067,7 +3557,15 @@
     </w:p>
     <w:p>
       <w:r>
-        <w:t>Build your React project using the npm run build command. This creates a folder of optimized static files. In AWS Console go to S3 and create a new bucket. Upload your build folder contents. Enable static website hosting on the bucket. Set bucket policy to allow public access. Your dashboard is now accessible via a public S3 URL.</w:t>
+        <w:t xml:space="preserve">Build your React project using the </w:t>
+      </w:r>
+      <w:proofErr w:type="spellStart"/>
+      <w:r>
+        <w:t>npm</w:t>
+      </w:r>
+      <w:proofErr w:type="spellEnd"/>
+      <w:r>
+        <w:t xml:space="preserve"> run build command. This creates a folder of optimized static files. In AWS Console go to S3 and create a new bucket. Upload your build folder contents. Enable static website hosting on the bucket. Set bucket policy to allow public access. Your dashboard is now accessible via a public S3 URL.</w:t>
       </w:r>
     </w:p>
     <w:p>
@@ -3310,13 +3808,23 @@
       </w:r>
     </w:p>
     <w:p>
-      <w:r>
-        <w:t>Client Side Error — when status code is 400, 401, 403, or 404. Means the app sent a bad request. Root cause is usually in the Flutter app code.</w:t>
-      </w:r>
-    </w:p>
-    <w:p>
-      <w:r>
-        <w:t>Server Side Error — when status code is 500, 502, or 503. Means the backend failed. Root cause is in the Node.js backend.</w:t>
+      <w:proofErr w:type="gramStart"/>
+      <w:r>
+        <w:t>Client Side</w:t>
+      </w:r>
+      <w:proofErr w:type="gramEnd"/>
+      <w:r>
+        <w:t xml:space="preserve"> Error — when status code is 400, 401, 403, or 404. Means the app sent a bad request. Root cause is usually in the Flutter app code.</w:t>
+      </w:r>
+    </w:p>
+    <w:p>
+      <w:proofErr w:type="gramStart"/>
+      <w:r>
+        <w:t>Server Side</w:t>
+      </w:r>
+      <w:proofErr w:type="gramEnd"/>
+      <w:r>
+        <w:t xml:space="preserve"> Error — when status code is 500, 502, or 503. Means the backend failed. Root cause is in the Node.js backend.</w:t>
       </w:r>
     </w:p>
     <w:p>
@@ -3345,7 +3853,15 @@
     </w:p>
     <w:p>
       <w:r>
-        <w:t>Add logic that groups similar errors together. If the same error message appears 10 times in an hour they are grouped as one incident rather than 10 separate alerts. This prevents alert fatigue and makes the dashboard cleaner.</w:t>
+        <w:t xml:space="preserve">Add logic that groups similar errors together. If the same error message appears 10 times in an </w:t>
+      </w:r>
+      <w:proofErr w:type="gramStart"/>
+      <w:r>
+        <w:t>hour</w:t>
+      </w:r>
+      <w:proofErr w:type="gramEnd"/>
+      <w:r>
+        <w:t xml:space="preserve"> they are grouped as one incident rather than 10 separate alerts. This prevents alert fatigue and makes the dashboard cleaner.</w:t>
       </w:r>
     </w:p>
     <w:p>
@@ -3567,12 +4083,21 @@
       </w:r>
     </w:p>
     <w:p>
-      <w:r>
-        <w:rPr>
-          <w:b/>
-          <w:bCs/>
-        </w:rPr>
-        <w:t>pgAdmin / AWS RDS Console</w:t>
+      <w:proofErr w:type="spellStart"/>
+      <w:r>
+        <w:rPr>
+          <w:b/>
+          <w:bCs/>
+        </w:rPr>
+        <w:t>pgAdmin</w:t>
+      </w:r>
+      <w:proofErr w:type="spellEnd"/>
+      <w:r>
+        <w:rPr>
+          <w:b/>
+          <w:bCs/>
+        </w:rPr>
+        <w:t xml:space="preserve"> / AWS RDS Console</w:t>
       </w:r>
       <w:r>
         <w:t xml:space="preserve"> — database verification</w:t>
@@ -3664,7 +4189,15 @@
     </w:p>
     <w:p>
       <w:r>
-        <w:t>Press slow API button — verify response time spike appears in React dashboard and alert is triggered.</w:t>
+        <w:t xml:space="preserve">Press slow API button — verify response time spike appears in React dashboard and alert </w:t>
+      </w:r>
+      <w:proofErr w:type="gramStart"/>
+      <w:r>
+        <w:t>is</w:t>
+      </w:r>
+      <w:proofErr w:type="gramEnd"/>
+      <w:r>
+        <w:t xml:space="preserve"> triggered.</w:t>
       </w:r>
     </w:p>
     <w:p>
@@ -3707,7 +4240,15 @@
     </w:p>
     <w:p>
       <w:r>
-        <w:t>Simulate multiple users using the app simultaneously. You can do this by making many rapid button presses or by writing a simple Postman collection that sends many requests quickly. Verify your backend handles the load and AWS CloudWatch shows the CPU spike.</w:t>
+        <w:t xml:space="preserve">Simulate multiple users using the app simultaneously. You can do this by making many rapid </w:t>
+      </w:r>
+      <w:proofErr w:type="gramStart"/>
+      <w:r>
+        <w:t>button</w:t>
+      </w:r>
+      <w:proofErr w:type="gramEnd"/>
+      <w:r>
+        <w:t xml:space="preserve"> presses or by writing a simple Postman collection that sends many requests quickly. Verify your backend handles the load and AWS CloudWatch shows the CPU spike.</w:t>
       </w:r>
     </w:p>
     <w:p>
@@ -3992,7 +4533,15 @@
         <w:t>Literature Review</w:t>
       </w:r>
       <w:r>
-        <w:t xml:space="preserve"> — mention existing tools like Firebase, Dynatrace, New Relic, and Datadog. Explain what they do and why you chose to build your own custom solution with open source tools. This shows academic research.</w:t>
+        <w:t xml:space="preserve"> — mention existing tools like Firebase, Dynatrace, New Relic, and Datadog. Explain what they do and why you chose to build your own custom solution with </w:t>
+      </w:r>
+      <w:proofErr w:type="gramStart"/>
+      <w:r>
+        <w:t>open source</w:t>
+      </w:r>
+      <w:proofErr w:type="gramEnd"/>
+      <w:r>
+        <w:t xml:space="preserve"> tools. This shows academic research.</w:t>
       </w:r>
     </w:p>
     <w:p>
@@ -4028,7 +4577,15 @@
         <w:t>Implementation</w:t>
       </w:r>
       <w:r>
-        <w:t xml:space="preserve"> — describe what you built in each milestone with screenshots. Include screenshots of Flutter app, React dashboard, Firebase Console, pgAdmin, and AWS Console.</w:t>
+        <w:t xml:space="preserve"> — describe what you built in each milestone with screenshots. Include screenshots of Flutter app, React dashboard, Firebase Console, </w:t>
+      </w:r>
+      <w:proofErr w:type="spellStart"/>
+      <w:r>
+        <w:t>pgAdmin</w:t>
+      </w:r>
+      <w:proofErr w:type="spellEnd"/>
+      <w:r>
+        <w:t>, and AWS Console.</w:t>
       </w:r>
     </w:p>
     <w:p>

</xml_diff>